<commit_message>
pushing after a longtime
</commit_message>
<xml_diff>
--- a/Resumes/NaveenDoddi-fullStack.docx
+++ b/Resumes/NaveenDoddi-fullStack.docx
@@ -13,36 +13,6 @@
           <w:szCs w:val="40"/>
         </w:rPr>
         <w:t>Doddi Naveen</w:t>
-      </w:r>
-      <w:r>
-        <w:rPr>
-          <w:w w:val="130"/>
-        </w:rPr>
-        <w:t xml:space="preserve"> </w:t>
-      </w:r>
-      <w:r>
-        <w:rPr>
-          <w:w w:val="130"/>
-          <w:sz w:val="20"/>
-          <w:szCs w:val="20"/>
-        </w:rPr>
-        <w:t>Bang</w:t>
-      </w:r>
-      <w:r>
-        <w:rPr>
-          <w:w w:val="130"/>
-          <w:sz w:val="20"/>
-          <w:szCs w:val="20"/>
-        </w:rPr>
-        <w:t>a</w:t>
-      </w:r>
-      <w:r>
-        <w:rPr>
-          <w:w w:val="130"/>
-          <w:sz w:val="20"/>
-          <w:szCs w:val="20"/>
-        </w:rPr>
-        <w:t>lore</w:t>
       </w:r>
     </w:p>
     <w:p>
@@ -191,9 +161,8 @@
           <w:rPr>
             <w:rStyle w:val="Hyperlink"/>
             <w:position w:val="1"/>
-            <w:u w:val="none"/>
           </w:rPr>
-          <w:t>prasadnaveen847@gmail.com</w:t>
+          <w:t>naveendoddi26@gmail.com</w:t>
         </w:r>
         <w:r>
           <w:rPr>
@@ -201,7 +170,6 @@
             <w:rFonts w:ascii="Times New Roman"/>
             <w:spacing w:val="21"/>
             <w:position w:val="1"/>
-            <w:u w:val="none"/>
           </w:rPr>
           <w:t xml:space="preserve"> </w:t>
         </w:r>
@@ -336,17 +304,8 @@
           <w:position w:val="1"/>
           <w:u w:val="single"/>
         </w:rPr>
-        <w:t>github.com/</w:t>
-      </w:r>
-      <w:proofErr w:type="spellStart"/>
-      <w:r>
-        <w:rPr>
-          <w:position w:val="1"/>
-          <w:u w:val="single"/>
-        </w:rPr>
-        <w:t>naveendoddi</w:t>
-      </w:r>
-      <w:proofErr w:type="spellEnd"/>
+        <w:t>github.com/naveendoddi</w:t>
+      </w:r>
       <w:r>
         <w:rPr>
           <w:position w:val="1"/>
@@ -411,23 +370,7 @@
           <w:position w:val="1"/>
           <w:u w:val="single"/>
         </w:rPr>
-        <w:t>naveendoddi.github.io/</w:t>
-      </w:r>
-      <w:proofErr w:type="spellStart"/>
-      <w:r>
-        <w:rPr>
-          <w:position w:val="1"/>
-          <w:u w:val="single"/>
-        </w:rPr>
-        <w:t>portFolio</w:t>
-      </w:r>
-      <w:proofErr w:type="spellEnd"/>
-      <w:r>
-        <w:rPr>
-          <w:position w:val="1"/>
-          <w:u w:val="single"/>
-        </w:rPr>
-        <w:t>/</w:t>
+        <w:t>naveendoddi.github.io/portFolio/</w:t>
       </w:r>
     </w:p>
     <w:p>
@@ -2690,21 +2633,12 @@
           </wp:anchor>
         </w:drawing>
       </w:r>
-      <w:proofErr w:type="spellStart"/>
       <w:r>
         <w:rPr>
           <w:w w:val="110"/>
           <w:sz w:val="20"/>
         </w:rPr>
-        <w:t>HackerRank</w:t>
-      </w:r>
-      <w:proofErr w:type="spellEnd"/>
-      <w:r>
-        <w:rPr>
-          <w:w w:val="110"/>
-          <w:sz w:val="20"/>
-        </w:rPr>
-        <w:t xml:space="preserve"> Problem Solving (5-star) – Demonstrated advanced problem-solving skills in data structures and algorithms.</w:t>
+        <w:t>HackerRank Problem Solving (5-star) – Demonstrated advanced problem-solving skills in data structures and algorithms.</w:t>
       </w:r>
     </w:p>
     <w:p>
@@ -2782,19 +2716,11 @@
           <w:docGrid w:linePitch="299"/>
         </w:sectPr>
       </w:pPr>
-      <w:proofErr w:type="spellStart"/>
-      <w:r>
-        <w:rPr>
-          <w:sz w:val="20"/>
-        </w:rPr>
-        <w:t>Nptel</w:t>
-      </w:r>
-      <w:proofErr w:type="spellEnd"/>
-      <w:r>
-        <w:rPr>
-          <w:sz w:val="20"/>
-        </w:rPr>
-        <w:t xml:space="preserve"> - The Joy of Computing Using Pytho</w:t>
+      <w:r>
+        <w:rPr>
+          <w:sz w:val="20"/>
+        </w:rPr>
+        <w:t>Nptel - The Joy of Computing Using Pytho</w:t>
       </w:r>
       <w:r>
         <w:rPr>
@@ -2949,30 +2875,84 @@
 <file path=word/numbering.xml><?xml version="1.0" encoding="utf-8"?>
 <w:numbering xmlns:wpc="http://schemas.microsoft.com/office/word/2010/wordprocessingCanvas" xmlns:cx="http://schemas.microsoft.com/office/drawing/2014/chartex" xmlns:cx1="http://schemas.microsoft.com/office/drawing/2015/9/8/chartex" xmlns:cx2="http://schemas.microsoft.com/office/drawing/2015/10/21/chartex" xmlns:cx3="http://schemas.microsoft.com/office/drawing/2016/5/9/chartex" xmlns:cx4="http://schemas.microsoft.com/office/drawing/2016/5/10/chartex" xmlns:cx5="http://schemas.microsoft.com/office/drawing/2016/5/11/chartex" xmlns:cx6="http://schemas.microsoft.com/office/drawing/2016/5/12/chartex" xmlns:cx7="http://schemas.microsoft.com/office/drawing/2016/5/13/chartex" xmlns:cx8="http://schemas.microsoft.com/office/drawing/2016/5/14/chartex" xmlns:mc="http://schemas.openxmlformats.org/markup-compatibility/2006" xmlns:aink="http://schemas.microsoft.com/office/drawing/2016/ink" xmlns:am3d="http://schemas.microsoft.com/office/drawing/2017/model3d" xmlns:o="urn:schemas-microsoft-com:office:office" xmlns:oel="http://schemas.microsoft.com/office/2019/extlst" xmlns:r="http://schemas.openxmlformats.org/officeDocument/2006/relationships" xmlns:m="http://schemas.openxmlformats.org/officeDocument/2006/math" xmlns:v="urn:schemas-microsoft-com:vml" xmlns:wp14="http://schemas.microsoft.com/office/word/2010/wordprocessingDrawing" xmlns:wp="http://schemas.openxmlformats.org/drawingml/2006/wordprocessingDrawing" xmlns:w10="urn:schemas-microsoft-com:office:word" xmlns:w="http://schemas.openxmlformats.org/wordprocessingml/2006/main" xmlns:w14="http://schemas.microsoft.com/office/word/2010/wordml" xmlns:w15="http://schemas.microsoft.com/office/word/2012/wordml" xmlns:w16cex="http://schemas.microsoft.com/office/word/2018/wordml/cex" xmlns:w16cid="http://schemas.microsoft.com/office/word/2016/wordml/cid" xmlns:w16="http://schemas.microsoft.com/office/word/2018/wordml" xmlns:w16du="http://schemas.microsoft.com/office/word/2023/wordml/word16du" xmlns:w16sdtdh="http://schemas.microsoft.com/office/word/2020/wordml/sdtdatahash" xmlns:w16sdtfl="http://schemas.microsoft.com/office/word/2024/wordml/sdtformatlock" xmlns:w16se="http://schemas.microsoft.com/office/word/2015/wordml/symex" xmlns:wpg="http://schemas.microsoft.com/office/word/2010/wordprocessingGroup" xmlns:wpi="http://schemas.microsoft.com/office/word/2010/wordprocessingInk" xmlns:wne="http://schemas.microsoft.com/office/word/2006/wordml" xmlns:wps="http://schemas.microsoft.com/office/word/2010/wordprocessingShape" mc:Ignorable="w14 w15 w16se w16cid w16 w16cex w16sdtdh w16sdtfl w16du wp14">
   <w:numPicBullet w:numPicBulletId="0">
-    <w:pict>
-      <v:shapetype id="_x0000_t75" coordsize="21600,21600" o:spt="75" o:preferrelative="t" path="m@4@5l@4@11@9@11@9@5xe" filled="f" stroked="f">
-        <v:stroke joinstyle="miter"/>
-        <v:formulas>
-          <v:f eqn="if lineDrawn pixelLineWidth 0"/>
-          <v:f eqn="sum @0 1 0"/>
-          <v:f eqn="sum 0 0 @1"/>
-          <v:f eqn="prod @2 1 2"/>
-          <v:f eqn="prod @3 21600 pixelWidth"/>
-          <v:f eqn="prod @3 21600 pixelHeight"/>
-          <v:f eqn="sum @0 0 1"/>
-          <v:f eqn="prod @6 1 2"/>
-          <v:f eqn="prod @7 21600 pixelWidth"/>
-          <v:f eqn="sum @8 21600 0"/>
-          <v:f eqn="prod @7 21600 pixelHeight"/>
-          <v:f eqn="sum @10 21600 0"/>
-        </v:formulas>
-        <v:path o:extrusionok="f" gradientshapeok="t" o:connecttype="rect"/>
-        <o:lock v:ext="edit" aspectratio="t"/>
-      </v:shapetype>
-      <v:shape id="_x0000_i1032" type="#_x0000_t75" style="width:409.55pt;height:409.55pt;visibility:visible;mso-wrap-style:square" o:bullet="t">
-        <v:imagedata r:id="rId1" o:title=""/>
-      </v:shape>
-    </w:pict>
+    <mc:AlternateContent>
+      <mc:Choice Requires="v">
+        <w:pict>
+          <v:shapetype w14:anchorId="527C9207" id="_x0000_t75" coordsize="21600,21600" o:spt="75" o:preferrelative="t" path="m@4@5l@4@11@9@11@9@5xe" filled="f" stroked="f">
+            <v:stroke joinstyle="miter"/>
+            <v:formulas>
+              <v:f eqn="if lineDrawn pixelLineWidth 0"/>
+              <v:f eqn="sum @0 1 0"/>
+              <v:f eqn="sum 0 0 @1"/>
+              <v:f eqn="prod @2 1 2"/>
+              <v:f eqn="prod @3 21600 pixelWidth"/>
+              <v:f eqn="prod @3 21600 pixelHeight"/>
+              <v:f eqn="sum @0 0 1"/>
+              <v:f eqn="prod @6 1 2"/>
+              <v:f eqn="prod @7 21600 pixelWidth"/>
+              <v:f eqn="sum @8 21600 0"/>
+              <v:f eqn="prod @7 21600 pixelHeight"/>
+              <v:f eqn="sum @10 21600 0"/>
+            </v:formulas>
+            <v:path o:extrusionok="f" gradientshapeok="t" o:connecttype="rect"/>
+            <o:lock v:ext="edit" aspectratio="t"/>
+          </v:shapetype>
+          <v:shape id="Picture 318557893" o:spid="_x0000_i1025" type="#_x0000_t75" style="width:409.5pt;height:409.5pt;visibility:visible;mso-wrap-style:square">
+            <v:imagedata r:id="rId1" o:title=""/>
+          </v:shape>
+        </w:pict>
+      </mc:Choice>
+      <mc:Fallback>
+        <w:drawing>
+          <wp:inline distT="0" distB="0" distL="0" distR="0" wp14:anchorId="5A9D27F5" wp14:editId="5A12C116">
+            <wp:extent cx="5200650" cy="5200650"/>
+            <wp:effectExtent l="0" t="0" r="0" b="0"/>
+            <wp:docPr id="318557893" name="Picture 318557893"/>
+            <wp:cNvGraphicFramePr>
+              <a:graphicFrameLocks xmlns:a="http://schemas.openxmlformats.org/drawingml/2006/main" noChangeAspect="1"/>
+            </wp:cNvGraphicFramePr>
+            <a:graphic xmlns:a="http://schemas.openxmlformats.org/drawingml/2006/main">
+              <a:graphicData uri="http://schemas.openxmlformats.org/drawingml/2006/picture">
+                <pic:pic xmlns:pic="http://schemas.openxmlformats.org/drawingml/2006/picture">
+                  <pic:nvPicPr>
+                    <pic:cNvPr id="0" name="Picture -1023"/>
+                    <pic:cNvPicPr>
+                      <a:picLocks noChangeAspect="1" noChangeArrowheads="1"/>
+                    </pic:cNvPicPr>
+                  </pic:nvPicPr>
+                  <pic:blipFill>
+                    <a:blip r:embed="rId2">
+                      <a:extLst>
+                        <a:ext uri="{28A0092B-C50C-407E-A947-70E740481C1C}">
+                          <a14:useLocalDpi xmlns:a14="http://schemas.microsoft.com/office/drawing/2010/main" val="0"/>
+                        </a:ext>
+                      </a:extLst>
+                    </a:blip>
+                    <a:srcRect/>
+                    <a:stretch>
+                      <a:fillRect/>
+                    </a:stretch>
+                  </pic:blipFill>
+                  <pic:spPr bwMode="auto">
+                    <a:xfrm>
+                      <a:off x="0" y="0"/>
+                      <a:ext cx="5200650" cy="5200650"/>
+                    </a:xfrm>
+                    <a:prstGeom prst="rect">
+                      <a:avLst/>
+                    </a:prstGeom>
+                    <a:noFill/>
+                    <a:ln>
+                      <a:noFill/>
+                    </a:ln>
+                  </pic:spPr>
+                </pic:pic>
+              </a:graphicData>
+            </a:graphic>
+          </wp:inline>
+        </w:drawing>
+      </mc:Fallback>
+    </mc:AlternateContent>
   </w:numPicBullet>
   <w:abstractNum w:abstractNumId="0" w15:restartNumberingAfterBreak="0">
     <w:nsid w:val="275056D1"/>

</xml_diff>